<commit_message>
docs: 修正报告幻觉 - 去Lua/去seckill_record/加前端/修正WebSocket/SADD/库存回滚
</commit_message>
<xml_diff>
--- a/docs/期末大作业报告.docx
+++ b/docs/期末大作业报告.docx
@@ -98,10 +98,10 @@
     </w:p>
     <w:p>
       <w:r>
-        <w:t>本报告以"AI驱动的\"高并发秒杀与智能电商\"后台系统"为题，基于Spring Cloud微服务架构，设计并实现了一套支持高并发秒杀与AI智能导购功能的电商后台系统。系统采用微服务拆分策略，包含用户服务(user-service)、商品服务(product-service)、订单服务(order-service)、秒杀服务(seckill-service)和AI导购服务(ai-service)五大微服务，以及统一API网关(flash-sale-gateway)作为请求入口。技术栈涵盖Spring Boot 2.7.x、Spring Cloud Gateway、MyBatis-Plus、MySQL 8.0、Redis、RabbitMQ、WebSocket和DeepSeek LLM API。</w:t>
-        <w:br/>
-        <w:br/>
-        <w:t>在核心高并发秒杀场景中，系统采用"Redis缓存预热+Lua原子扣减+RabbitMQ异步削峰+订单服务异步落库+WebSocket实时推送"的四层架构策略，有效解决了超卖、订单风暴和结果实时通知三大难题。经实测，在4核CPU/3.6GB内存的受限环境下，系统可在7.4秒内完成10000件单商品的秒杀处理，库存完全一致、零超卖。在全流程E2E万人并发测试中，10000名用户从注册到支付的全链路（注册→登录→建地址→加购→下单→支付→秒杀→轮询确认）实现0错误率。</w:t>
+        <w:t>本报告以"AI驱动的\"高并发秒杀与智能电商\"后台系统"为题，基于Spring Cloud微服务架构，设计并实现了一套支持高并发秒杀与AI智能导购功能的电商后台系统。系统采用微服务拆分策略，包含用户服务(user-service)、商品服务(product-service)、订单服务(order-service)、秒杀服务(seckill-service)和AI导购服务(ai-service)五大微服务，以及统一API网关(gateway)作为请求入口。前端采用Vue 3 + TypeScript + Element Plus构建，提供登录注册、商品浏览购物、秒杀抢购、AI导购对话等完整用户界面。技术栈涵盖Spring Boot 2.7.x、Spring Cloud Gateway、MyBatis-Plus、MySQL 8.0、Redis、RabbitMQ、WebSocket和DeepSeek LLM API。</w:t>
+        <w:br/>
+        <w:br/>
+        <w:t>在核心高并发秒杀场景中，系统采用"Redis缓存预热+DECR原子扣减+RabbitMQ异步削峰+订单服务异步落库+WebSocket实时推送"的四层架构策略，有效解决了超卖、订单风暴和结果实时通知三大难题。经实测，在4核CPU/3.6GB内存的受限环境下，系统可在7.4秒内完成10000件单商品的秒杀处理，库存完全一致、零超卖。在全流程E2E万人并发测试中，10000名用户从注册到支付的全链路（注册→登录→建地址→加购→下单→支付→秒杀→轮询确认）实现0错误率。</w:t>
         <w:br/>
         <w:br/>
         <w:t>系统还集成了DeepSeek大语言模型，通过RabbitMQ请求排队与限流保护策略，为用户提供智能商品导购推荐服务。同时，所有服务均通过统一网关限流、跨域配置和JWT令牌校验保障安全性。文档详细记录了本地原型架构、数据库ER设计、API接口规范、缓存与消息策略、技术选型依据以及面向百万日活的生产环境演进方案。</w:t>
@@ -550,7 +550,7 @@
           </w:tcPr>
           <w:p>
             <w:r>
-              <w:t>创建活动、启用/结束活动、Redis库存预热、Lua原子扣减、MQ异步削峰、订单落库</w:t>
+              <w:t>创建活动、启用/结束活动、Redis库存预热、DECR原子扣减、MQ异步削峰、订单落库</w:t>
             </w:r>
           </w:p>
         </w:tc>
@@ -679,7 +679,7 @@
         <w:br/>
         <w:t xml:space="preserve">  - 秒杀接口响应(&lt;500ms): Redis扣减阶段；吞吐量(≥2000req/s): 网关限流上限</w:t>
         <w:br/>
-        <w:t xml:space="preserve">  - 库存一致性: 零超卖（Redis Lua原子扣减保障）</w:t>
+        <w:t xml:space="preserve">  - 库存一致性: 零超卖（Redis DECR原子扣减保障）</w:t>
         <w:br/>
         <w:t xml:space="preserve">  - 订单最终一致性: MQ异步，99.9%订单10秒内落库</w:t>
         <w:br/>
@@ -905,7 +905,7 @@
           </w:tcPr>
           <w:p>
             <w:r>
-              <w:t>flash-sale-gateway</w:t>
+              <w:t>gateway</w:t>
             </w:r>
           </w:p>
         </w:tc>
@@ -1051,17 +1051,17 @@
           </w:tcPr>
           <w:p>
             <w:r>
-              <w:t>订单创建/支付/查询、购物车管理、WebSocket推送</w:t>
-            </w:r>
-          </w:p>
-        </w:tc>
-        <w:tc>
-          <w:tcPr>
-            <w:tcW w:type="dxa" w:w="2160"/>
-          </w:tcPr>
-          <w:p>
-            <w:r>
-              <w:t>Spring Boot, MyBatis-Plus, WebSocket</w:t>
+              <w:t>订单创建/支付/查询、购物车/优惠券管理</w:t>
+            </w:r>
+          </w:p>
+        </w:tc>
+        <w:tc>
+          <w:tcPr>
+            <w:tcW w:type="dxa" w:w="2160"/>
+          </w:tcPr>
+          <w:p>
+            <w:r>
+              <w:t>Spring Boot, MyBatis-Plus</w:t>
             </w:r>
           </w:p>
         </w:tc>
@@ -1135,17 +1135,101 @@
           </w:tcPr>
           <w:p>
             <w:r>
-              <w:t>秒杀活动管理、Redis库存预热、Lua原子扣减、MQ消息发送</w:t>
-            </w:r>
-          </w:p>
-        </w:tc>
-        <w:tc>
-          <w:tcPr>
-            <w:tcW w:type="dxa" w:w="2160"/>
-          </w:tcPr>
-          <w:p>
-            <w:r>
-              <w:t>Spring Boot, Redis, RabbitMQ, Lua</w:t>
+              <w:t>秒杀活动管理、Redis库存预热、DECR原子扣减、MQ消息发送</w:t>
+            </w:r>
+          </w:p>
+        </w:tc>
+        <w:tc>
+          <w:tcPr>
+            <w:tcW w:type="dxa" w:w="2160"/>
+          </w:tcPr>
+          <w:p>
+            <w:r>
+              <w:t>Spring Boot, Redis, RabbitMQ</w:t>
+            </w:r>
+          </w:p>
+        </w:tc>
+      </w:tr>
+      <w:tr>
+        <w:tc>
+          <w:tcPr>
+            <w:tcW w:type="dxa" w:w="2160"/>
+          </w:tcPr>
+          <w:p>
+            <w:r>
+              <w:t>flash-sale-common</w:t>
+            </w:r>
+          </w:p>
+        </w:tc>
+        <w:tc>
+          <w:tcPr>
+            <w:tcW w:type="dxa" w:w="2160"/>
+          </w:tcPr>
+          <w:p>
+            <w:r>
+              <w:t>—</w:t>
+            </w:r>
+          </w:p>
+        </w:tc>
+        <w:tc>
+          <w:tcPr>
+            <w:tcW w:type="dxa" w:w="2160"/>
+          </w:tcPr>
+          <w:p>
+            <w:r>
+              <w:t>公共模块：WebSocket推送、统一异常处理、DTO</w:t>
+            </w:r>
+          </w:p>
+        </w:tc>
+        <w:tc>
+          <w:tcPr>
+            <w:tcW w:type="dxa" w:w="2160"/>
+          </w:tcPr>
+          <w:p>
+            <w:r>
+              <w:t>Spring Boot, WebSocket</w:t>
+            </w:r>
+          </w:p>
+        </w:tc>
+      </w:tr>
+      <w:tr>
+        <w:tc>
+          <w:tcPr>
+            <w:tcW w:type="dxa" w:w="2160"/>
+          </w:tcPr>
+          <w:p>
+            <w:r>
+              <w:t>flash-sale-web</w:t>
+            </w:r>
+          </w:p>
+        </w:tc>
+        <w:tc>
+          <w:tcPr>
+            <w:tcW w:type="dxa" w:w="2160"/>
+          </w:tcPr>
+          <w:p>
+            <w:r>
+              <w:t>3000</w:t>
+            </w:r>
+          </w:p>
+        </w:tc>
+        <w:tc>
+          <w:tcPr>
+            <w:tcW w:type="dxa" w:w="2160"/>
+          </w:tcPr>
+          <w:p>
+            <w:r>
+              <w:t>前端应用：Vue 3 + Element Plus UI</w:t>
+            </w:r>
+          </w:p>
+        </w:tc>
+        <w:tc>
+          <w:tcPr>
+            <w:tcW w:type="dxa" w:w="2160"/>
+          </w:tcPr>
+          <w:p>
+            <w:r>
+              <w:t>Vite, TypeScript, Axios</w:t>
             </w:r>
           </w:p>
         </w:tc>
@@ -1395,15 +1479,15 @@
         <w:br/>
         <w:t>2. Gateway验证Token → 限流检查(seckill-capacity=2000) → 路由到seckill-service</w:t>
         <w:br/>
-        <w:t>3. seckill-service接收请求，调用Redis Lua脚本原子扣减库存</w:t>
-        <w:br/>
-        <w:t>4. 扣减成功 → 创建秒杀记录(status=QUEUING) → 发送MQ消息 → 返回"排队中"</w:t>
-        <w:br/>
-        <w:t>5. 扣减失败(库存不足/重复秒杀) → 返回失败</w:t>
-        <w:br/>
-        <w:t>6. order-service消费MQ消息 → 创建正式订单 → 更新秒杀记录状态为SUCCESS</w:t>
-        <w:br/>
-        <w:t>7. order-service通过WebSocket连接向用户推送"订单创建成功"消息</w:t>
+        <w:t>3. seckill-service接收请求 → SADD检查防重复(SISMEMBER seckill:bought) → DECR原子扣减库存</w:t>
+        <w:br/>
+        <w:t>4. 扣减成功 → SADD标记已抢购 → 发送MQ消息 → 返回"排队中"</w:t>
+        <w:br/>
+        <w:t>5. 扣减失败(库存不足/已抢购过) → 返回失败</w:t>
+        <w:br/>
+        <w:t>6. order-service消费MQ消息 → 创建正式订单</w:t>
+        <w:br/>
+        <w:t>7. flash-sale-common通过WebSocket连接向用户推送"订单创建成功"消息</w:t>
         <w:br/>
         <w:t>8. 客户端通过轮询 /api/order/list 或等待WebSocket推送确认订单</w:t>
       </w:r>
@@ -2384,7 +2468,7 @@
         <w:pStyle w:val="Heading3"/>
       </w:pPr>
       <w:r>
-        <w:t>订单表 (order_tbl)</w:t>
+        <w:t>订单表 (`order`)</w:t>
       </w:r>
     </w:p>
     <w:tbl>
@@ -3270,379 +3354,23 @@
         <w:pStyle w:val="Heading3"/>
       </w:pPr>
       <w:r>
-        <w:t>秒杀记录表 (seckill_record)</w:t>
+        <w:t>活动秒杀状态追踪（Redis + order表）</w:t>
       </w:r>
     </w:p>
-    <w:tbl>
-      <w:tblPr>
-        <w:tblStyle w:val="TableGrid"/>
-        <w:tblW w:type="auto" w:w="0"/>
-        <w:jc w:val="center"/>
-        <w:tblLook w:firstColumn="1" w:firstRow="1" w:lastColumn="0" w:lastRow="0" w:noHBand="0" w:noVBand="1" w:val="04A0"/>
-      </w:tblPr>
-      <w:tblGrid>
-        <w:gridCol w:w="2160"/>
-        <w:gridCol w:w="2160"/>
-        <w:gridCol w:w="2160"/>
-        <w:gridCol w:w="2160"/>
-      </w:tblGrid>
-      <w:tr>
-        <w:tc>
-          <w:tcPr>
-            <w:tcW w:type="dxa" w:w="2160"/>
-          </w:tcPr>
-          <w:p>
-            <w:pPr>
-              <w:jc w:val="center"/>
-            </w:pPr>
-            <w:r>
-              <w:rPr>
-                <w:b/>
-              </w:rPr>
-              <w:t>字段名</w:t>
-            </w:r>
-          </w:p>
-        </w:tc>
-        <w:tc>
-          <w:tcPr>
-            <w:tcW w:type="dxa" w:w="2160"/>
-          </w:tcPr>
-          <w:p>
-            <w:pPr>
-              <w:jc w:val="center"/>
-            </w:pPr>
-            <w:r>
-              <w:rPr>
-                <w:b/>
-              </w:rPr>
-              <w:t>类型</w:t>
-            </w:r>
-          </w:p>
-        </w:tc>
-        <w:tc>
-          <w:tcPr>
-            <w:tcW w:type="dxa" w:w="2160"/>
-          </w:tcPr>
-          <w:p>
-            <w:pPr>
-              <w:jc w:val="center"/>
-            </w:pPr>
-            <w:r>
-              <w:rPr>
-                <w:b/>
-              </w:rPr>
-              <w:t>约束</w:t>
-            </w:r>
-          </w:p>
-        </w:tc>
-        <w:tc>
-          <w:tcPr>
-            <w:tcW w:type="dxa" w:w="2160"/>
-          </w:tcPr>
-          <w:p>
-            <w:pPr>
-              <w:jc w:val="center"/>
-            </w:pPr>
-            <w:r>
-              <w:rPr>
-                <w:b/>
-              </w:rPr>
-              <w:t>说明</w:t>
-            </w:r>
-          </w:p>
-        </w:tc>
-      </w:tr>
-      <w:tr>
-        <w:tc>
-          <w:tcPr>
-            <w:tcW w:type="dxa" w:w="2160"/>
-          </w:tcPr>
-          <w:p>
-            <w:r>
-              <w:t>id</w:t>
-            </w:r>
-          </w:p>
-        </w:tc>
-        <w:tc>
-          <w:tcPr>
-            <w:tcW w:type="dxa" w:w="2160"/>
-          </w:tcPr>
-          <w:p>
-            <w:r>
-              <w:t>BIGINT</w:t>
-            </w:r>
-          </w:p>
-        </w:tc>
-        <w:tc>
-          <w:tcPr>
-            <w:tcW w:type="dxa" w:w="2160"/>
-          </w:tcPr>
-          <w:p>
-            <w:r>
-              <w:t>PK AUTO_INCREMENT</w:t>
-            </w:r>
-          </w:p>
-        </w:tc>
-        <w:tc>
-          <w:tcPr>
-            <w:tcW w:type="dxa" w:w="2160"/>
-          </w:tcPr>
-          <w:p>
-            <w:r>
-              <w:t>记录ID</w:t>
-            </w:r>
-          </w:p>
-        </w:tc>
-      </w:tr>
-      <w:tr>
-        <w:tc>
-          <w:tcPr>
-            <w:tcW w:type="dxa" w:w="2160"/>
-          </w:tcPr>
-          <w:p>
-            <w:r>
-              <w:t>user_id</w:t>
-            </w:r>
-          </w:p>
-        </w:tc>
-        <w:tc>
-          <w:tcPr>
-            <w:tcW w:type="dxa" w:w="2160"/>
-          </w:tcPr>
-          <w:p>
-            <w:r>
-              <w:t>BIGINT</w:t>
-            </w:r>
-          </w:p>
-        </w:tc>
-        <w:tc>
-          <w:tcPr>
-            <w:tcW w:type="dxa" w:w="2160"/>
-          </w:tcPr>
-          <w:p>
-            <w:r>
-              <w:t>FK → user.id</w:t>
-            </w:r>
-          </w:p>
-        </w:tc>
-        <w:tc>
-          <w:tcPr>
-            <w:tcW w:type="dxa" w:w="2160"/>
-          </w:tcPr>
-          <w:p>
-            <w:r>
-              <w:t>用户ID</w:t>
-            </w:r>
-          </w:p>
-        </w:tc>
-      </w:tr>
-      <w:tr>
-        <w:tc>
-          <w:tcPr>
-            <w:tcW w:type="dxa" w:w="2160"/>
-          </w:tcPr>
-          <w:p>
-            <w:r>
-              <w:t>activity_id</w:t>
-            </w:r>
-          </w:p>
-        </w:tc>
-        <w:tc>
-          <w:tcPr>
-            <w:tcW w:type="dxa" w:w="2160"/>
-          </w:tcPr>
-          <w:p>
-            <w:r>
-              <w:t>BIGINT</w:t>
-            </w:r>
-          </w:p>
-        </w:tc>
-        <w:tc>
-          <w:tcPr>
-            <w:tcW w:type="dxa" w:w="2160"/>
-          </w:tcPr>
-          <w:p>
-            <w:r>
-              <w:t>FK → activity.id</w:t>
-            </w:r>
-          </w:p>
-        </w:tc>
-        <w:tc>
-          <w:tcPr>
-            <w:tcW w:type="dxa" w:w="2160"/>
-          </w:tcPr>
-          <w:p>
-            <w:r>
-              <w:t>活动ID</w:t>
-            </w:r>
-          </w:p>
-        </w:tc>
-      </w:tr>
-      <w:tr>
-        <w:tc>
-          <w:tcPr>
-            <w:tcW w:type="dxa" w:w="2160"/>
-          </w:tcPr>
-          <w:p>
-            <w:r>
-              <w:t>order_id</w:t>
-            </w:r>
-          </w:p>
-        </w:tc>
-        <w:tc>
-          <w:tcPr>
-            <w:tcW w:type="dxa" w:w="2160"/>
-          </w:tcPr>
-          <w:p>
-            <w:r>
-              <w:t>BIGINT</w:t>
-            </w:r>
-          </w:p>
-        </w:tc>
-        <w:tc>
-          <w:tcPr>
-            <w:tcW w:type="dxa" w:w="2160"/>
-          </w:tcPr>
-          <w:p>
-            <w:r>
-              <w:t>可NULL</w:t>
-            </w:r>
-          </w:p>
-        </w:tc>
-        <w:tc>
-          <w:tcPr>
-            <w:tcW w:type="dxa" w:w="2160"/>
-          </w:tcPr>
-          <w:p>
-            <w:r>
-              <w:t>最终订单ID</w:t>
-            </w:r>
-          </w:p>
-        </w:tc>
-      </w:tr>
-      <w:tr>
-        <w:tc>
-          <w:tcPr>
-            <w:tcW w:type="dxa" w:w="2160"/>
-          </w:tcPr>
-          <w:p>
-            <w:r>
-              <w:t>status</w:t>
-            </w:r>
-          </w:p>
-        </w:tc>
-        <w:tc>
-          <w:tcPr>
-            <w:tcW w:type="dxa" w:w="2160"/>
-          </w:tcPr>
-          <w:p>
-            <w:r>
-              <w:t>VARCHAR(20)</w:t>
-            </w:r>
-          </w:p>
-        </w:tc>
-        <w:tc>
-          <w:tcPr>
-            <w:tcW w:type="dxa" w:w="2160"/>
-          </w:tcPr>
-          <w:p>
-            <w:r>
-              <w:t>NOT NULL</w:t>
-            </w:r>
-          </w:p>
-        </w:tc>
-        <w:tc>
-          <w:tcPr>
-            <w:tcW w:type="dxa" w:w="2160"/>
-          </w:tcPr>
-          <w:p>
-            <w:r>
-              <w:t>QUEUING/SUCCESS/FAILED</w:t>
-            </w:r>
-          </w:p>
-        </w:tc>
-      </w:tr>
-      <w:tr>
-        <w:tc>
-          <w:tcPr>
-            <w:tcW w:type="dxa" w:w="2160"/>
-          </w:tcPr>
-          <w:p>
-            <w:r>
-              <w:t>created_at</w:t>
-            </w:r>
-          </w:p>
-        </w:tc>
-        <w:tc>
-          <w:tcPr>
-            <w:tcW w:type="dxa" w:w="2160"/>
-          </w:tcPr>
-          <w:p>
-            <w:r>
-              <w:t>DATETIME</w:t>
-            </w:r>
-          </w:p>
-        </w:tc>
-        <w:tc>
-          <w:tcPr>
-            <w:tcW w:type="dxa" w:w="2160"/>
-          </w:tcPr>
-          <w:p>
-            <w:r>
-              <w:t>NOT NULL</w:t>
-            </w:r>
-          </w:p>
-        </w:tc>
-        <w:tc>
-          <w:tcPr>
-            <w:tcW w:type="dxa" w:w="2160"/>
-          </w:tcPr>
-          <w:p>
-            <w:r>
-              <w:t>创建时间</w:t>
-            </w:r>
-          </w:p>
-        </w:tc>
-      </w:tr>
-      <w:tr>
-        <w:tc>
-          <w:tcPr>
-            <w:tcW w:type="dxa" w:w="2160"/>
-          </w:tcPr>
-          <w:p>
-            <w:r/>
-          </w:p>
-        </w:tc>
-        <w:tc>
-          <w:tcPr>
-            <w:tcW w:type="dxa" w:w="2160"/>
-          </w:tcPr>
-          <w:p>
-            <w:r/>
-          </w:p>
-        </w:tc>
-        <w:tc>
-          <w:tcPr>
-            <w:tcW w:type="dxa" w:w="2160"/>
-          </w:tcPr>
-          <w:p>
-            <w:r>
-              <w:t>UNIQUE(user_id, activity_id)</w:t>
-            </w:r>
-          </w:p>
-        </w:tc>
-        <w:tc>
-          <w:tcPr>
-            <w:tcW w:type="dxa" w:w="2160"/>
-          </w:tcPr>
-          <w:p>
-            <w:r>
-              <w:t>幂等约束</w:t>
-            </w:r>
-          </w:p>
-        </w:tc>
-      </w:tr>
-    </w:tbl>
+    <w:p>
+      <w:r>
+        <w:t>系统未使用独立的秒杀记录表，而是通过Redis和order表协作实现秒杀状态追踪：</w:t>
+        <w:br/>
+        <w:br/>
+        <w:t>1. Redis SADD集合（`seckill:bought:{activityId}`）：记录已抢购用户ID，防止重复抢购</w:t>
+        <w:br/>
+        <w:t>2. order表的`seckill_activity_id`字段：标识秒杀订单，status字段追踪订单状态</w:t>
+        <w:br/>
+        <w:t>3. MQ消息驱动：秒杀请求→DECR扣库存→SADD标记→MQ消息→order-service消费创建订单</w:t>
+        <w:br/>
+        <w:t>4. 幂等保障：order_no的UNIQUE约束防止重复落单；SADD防止重复抢购</w:t>
+      </w:r>
+    </w:p>
     <w:p>
       <w:pPr>
         <w:pStyle w:val="Heading2"/>
@@ -3905,7 +3633,7 @@
           </w:tcPr>
           <w:p>
             <w:r>
-              <w:t>order_tbl</w:t>
+              <w:t>`order`</w:t>
             </w:r>
           </w:p>
         </w:tc>
@@ -3947,7 +3675,7 @@
           </w:tcPr>
           <w:p>
             <w:r>
-              <w:t>order_tbl</w:t>
+              <w:t>`order`</w:t>
             </w:r>
           </w:p>
         </w:tc>
@@ -3989,7 +3717,7 @@
           </w:tcPr>
           <w:p>
             <w:r>
-              <w:t>order_tbl</w:t>
+              <w:t>`order`</w:t>
             </w:r>
           </w:p>
         </w:tc>
@@ -4031,7 +3759,7 @@
           </w:tcPr>
           <w:p>
             <w:r>
-              <w:t>order_tbl</w:t>
+              <w:t>`order`</w:t>
             </w:r>
           </w:p>
         </w:tc>
@@ -4073,37 +3801,37 @@
           </w:tcPr>
           <w:p>
             <w:r>
-              <w:t>seckill_record</w:t>
-            </w:r>
-          </w:p>
-        </w:tc>
-        <w:tc>
-          <w:tcPr>
-            <w:tcW w:type="dxa" w:w="2160"/>
-          </w:tcPr>
-          <w:p>
-            <w:r>
-              <w:t>user_id, activity_id</w:t>
-            </w:r>
-          </w:p>
-        </w:tc>
-        <w:tc>
-          <w:tcPr>
-            <w:tcW w:type="dxa" w:w="2160"/>
-          </w:tcPr>
-          <w:p>
-            <w:r>
-              <w:t>UNIQUE</w:t>
-            </w:r>
-          </w:p>
-        </w:tc>
-        <w:tc>
-          <w:tcPr>
-            <w:tcW w:type="dxa" w:w="2160"/>
-          </w:tcPr>
-          <w:p>
-            <w:r>
-              <w:t>防止同一用户重复秒杀（幂等性）</w:t>
+              <w:t>cart</w:t>
+            </w:r>
+          </w:p>
+        </w:tc>
+        <w:tc>
+          <w:tcPr>
+            <w:tcW w:type="dxa" w:w="2160"/>
+          </w:tcPr>
+          <w:p>
+            <w:r>
+              <w:t>user_id</w:t>
+            </w:r>
+          </w:p>
+        </w:tc>
+        <w:tc>
+          <w:tcPr>
+            <w:tcW w:type="dxa" w:w="2160"/>
+          </w:tcPr>
+          <w:p>
+            <w:r>
+              <w:t>普通索引</w:t>
+            </w:r>
+          </w:p>
+        </w:tc>
+        <w:tc>
+          <w:tcPr>
+            <w:tcW w:type="dxa" w:w="2160"/>
+          </w:tcPr>
+          <w:p>
+            <w:r>
+              <w:t>用户购物车查询</w:t>
             </w:r>
           </w:p>
         </w:tc>
@@ -4115,17 +3843,17 @@
           </w:tcPr>
           <w:p>
             <w:r>
-              <w:t>seckill_record</w:t>
-            </w:r>
-          </w:p>
-        </w:tc>
-        <w:tc>
-          <w:tcPr>
-            <w:tcW w:type="dxa" w:w="2160"/>
-          </w:tcPr>
-          <w:p>
-            <w:r>
-              <w:t>activity_id</w:t>
+              <w:t>address</w:t>
+            </w:r>
+          </w:p>
+        </w:tc>
+        <w:tc>
+          <w:tcPr>
+            <w:tcW w:type="dxa" w:w="2160"/>
+          </w:tcPr>
+          <w:p>
+            <w:r>
+              <w:t>user_id</w:t>
             </w:r>
           </w:p>
         </w:tc>
@@ -4145,7 +3873,7 @@
           </w:tcPr>
           <w:p>
             <w:r>
-              <w:t>按活动查询秒杀记录</w:t>
+              <w:t>用户地址列表查询</w:t>
             </w:r>
           </w:p>
         </w:tc>
@@ -4157,17 +3885,17 @@
           </w:tcPr>
           <w:p>
             <w:r>
-              <w:t>cart</w:t>
-            </w:r>
-          </w:p>
-        </w:tc>
-        <w:tc>
-          <w:tcPr>
-            <w:tcW w:type="dxa" w:w="2160"/>
-          </w:tcPr>
-          <w:p>
-            <w:r>
-              <w:t>user_id</w:t>
+              <w:t>product_review</w:t>
+            </w:r>
+          </w:p>
+        </w:tc>
+        <w:tc>
+          <w:tcPr>
+            <w:tcW w:type="dxa" w:w="2160"/>
+          </w:tcPr>
+          <w:p>
+            <w:r>
+              <w:t>product_id</w:t>
             </w:r>
           </w:p>
         </w:tc>
@@ -4187,7 +3915,7 @@
           </w:tcPr>
           <w:p>
             <w:r>
-              <w:t>用户购物车查询</w:t>
+              <w:t>按商品查评价</w:t>
             </w:r>
           </w:p>
         </w:tc>
@@ -4199,7 +3927,7 @@
           </w:tcPr>
           <w:p>
             <w:r>
-              <w:t>address</w:t>
+              <w:t>user_favorite</w:t>
             </w:r>
           </w:p>
         </w:tc>
@@ -4229,7 +3957,91 @@
           </w:tcPr>
           <w:p>
             <w:r>
-              <w:t>用户地址列表查询</w:t>
+              <w:t>用户收藏列表</w:t>
+            </w:r>
+          </w:p>
+        </w:tc>
+      </w:tr>
+      <w:tr>
+        <w:tc>
+          <w:tcPr>
+            <w:tcW w:type="dxa" w:w="2160"/>
+          </w:tcPr>
+          <w:p>
+            <w:r>
+              <w:t>coupon</w:t>
+            </w:r>
+          </w:p>
+        </w:tc>
+        <w:tc>
+          <w:tcPr>
+            <w:tcW w:type="dxa" w:w="2160"/>
+          </w:tcPr>
+          <w:p>
+            <w:r>
+              <w:t>code</w:t>
+            </w:r>
+          </w:p>
+        </w:tc>
+        <w:tc>
+          <w:tcPr>
+            <w:tcW w:type="dxa" w:w="2160"/>
+          </w:tcPr>
+          <w:p>
+            <w:r>
+              <w:t>UNIQUE</w:t>
+            </w:r>
+          </w:p>
+        </w:tc>
+        <w:tc>
+          <w:tcPr>
+            <w:tcW w:type="dxa" w:w="2160"/>
+          </w:tcPr>
+          <w:p>
+            <w:r>
+              <w:t>优惠券码唯一</w:t>
+            </w:r>
+          </w:p>
+        </w:tc>
+      </w:tr>
+      <w:tr>
+        <w:tc>
+          <w:tcPr>
+            <w:tcW w:type="dxa" w:w="2160"/>
+          </w:tcPr>
+          <w:p>
+            <w:r>
+              <w:t>user_coupon</w:t>
+            </w:r>
+          </w:p>
+        </w:tc>
+        <w:tc>
+          <w:tcPr>
+            <w:tcW w:type="dxa" w:w="2160"/>
+          </w:tcPr>
+          <w:p>
+            <w:r>
+              <w:t>user_id</w:t>
+            </w:r>
+          </w:p>
+        </w:tc>
+        <w:tc>
+          <w:tcPr>
+            <w:tcW w:type="dxa" w:w="2160"/>
+          </w:tcPr>
+          <w:p>
+            <w:r>
+              <w:t>普通索引</w:t>
+            </w:r>
+          </w:p>
+        </w:tc>
+        <w:tc>
+          <w:tcPr>
+            <w:tcW w:type="dxa" w:w="2160"/>
+          </w:tcPr>
+          <w:p>
+            <w:r>
+              <w:t>用户优惠券查询</w:t>
             </w:r>
           </w:p>
         </w:tc>
@@ -4247,11 +4059,13 @@
       <w:r>
         <w:t>1. 普通CRUD操作：使用Spring @Transactional声明式事务，默认REQUIRED传播行为。</w:t>
         <w:br/>
-        <w:t>2. 秒杀扣减：Redis原子扣减（Lua脚本）先于数据库操作，保证缓存层不超卖。</w:t>
-        <w:br/>
-        <w:t>3. 订单一致性：MQ异步消息实现最终一致性——秒杀记录状态=QUEUING → MQ消费成功 → 状态更新为SUCCESS。</w:t>
-        <w:br/>
-        <w:t>4. 幂等保障：seckill_record表的UNIQUE(user_id, activity_id)约束防止重复秒杀记录；order_no的UNIQUE约束防止重复订单。</w:t>
+        <w:t>2. 秒杀扣减：Redis DECR原子扣减先于数据库操作，保证缓存层不超卖。</w:t>
+        <w:br/>
+        <w:t>3. 订单一致性：MQ异步消息实现最终一致性——DECR库存→MQ消息→order-service消费→创建正式订单。</w:t>
+        <w:br/>
+        <w:t>4. 幂等保障：Redis的SADD集合（`seckill:bought:{activityId}`）防止同一用户重复抢购；order_no的UNIQUE约束防止重复订单。</w:t>
+        <w:br/>
+        <w:t>5. 库存回滚：DECR返回值&lt;0时执行INCR回滚，确保库存不扣为负。</w:t>
       </w:r>
     </w:p>
     <w:p>
@@ -4285,7 +4099,7 @@
         <w:pStyle w:val="Heading3"/>
       </w:pPr>
       <w:r>
-        <w:t>4.1.1 秒杀库存预热与Lua原子扣减</w:t>
+        <w:t>4.1.1 秒杀库存预热与DECR原子扣减</w:t>
       </w:r>
     </w:p>
     <w:p>
@@ -4293,24 +4107,21 @@
         <w:t>数据结构：使用Redis的String类型，Key格式为 seckill:stock:{activityId}，Value为剩余库存整数。</w:t>
         <w:br/>
         <w:br/>
-        <w:t>预热流程：管理员启动活动后，先通过Warm-up接口将总库存从MySQL写入Redis（SET seckill:stock:{id} {totalStock}）。</w:t>
-        <w:br/>
-        <w:br/>
-        <w:t>扣减Lua脚本（原子性保证）：</w:t>
-        <w:br/>
-        <w:t xml:space="preserve">  local stock = redis.call("GET", KEYS[1])</w:t>
-        <w:br/>
-        <w:t xml:space="preserve">  if not stock or tonumber(stock) &lt;= 0 then return 0 end</w:t>
-        <w:br/>
-        <w:t xml:space="preserve">  redis.call("DECR", KEYS[1])</w:t>
-        <w:br/>
-        <w:t xml:space="preserve">  return 1</w:t>
-        <w:br/>
-        <w:br/>
-        <w:t>该Lua脚本保证扣减操作的原子性，在高并发下不会出现超卖。Redis单线程模型天然避免竞态条件。</w:t>
-        <w:br/>
-        <w:br/>
-        <w:t>回滚机制：如果MQ消费失败（订单创建异常），通过兜底任务将扣减的库存加回Redis。</w:t>
+        <w:t>预热流程：管理员启动活动后，先通过Warm-up接口将总库存从MySQL写入Redis（SET seckill:stock:{id} {totalStock}），同时写入活动元信息（seckill:activity:status / time / productId / price 等键）。</w:t>
+        <w:br/>
+        <w:br/>
+        <w:t>扣减流程（Java DECR命令，无需Lua脚本）：</w:t>
+        <w:br/>
+        <w:t xml:space="preserve">  1. SADD检查 seckill:bought:{activityId} set，确认用户未重复抢购</w:t>
+        <w:br/>
+        <w:t xml:space="preserve">  2. DECR seckill:stock:{activityId} 原子减1</w:t>
+        <w:br/>
+        <w:t xml:space="preserve">  3. 若返回值 &lt; 0，执行INCR回滚，返回"库存不足"</w:t>
+        <w:br/>
+        <w:t xml:space="preserve">  4. 若返回值 &gt;= 0，SADD标记已抢购，发送MQ消息异步落单</w:t>
+        <w:br/>
+        <w:br/>
+        <w:t>Redis单线程模型天然保证DECR的原子性，在高并发下不会出现超卖。SADD+DECR+MQ的组合方案在10000人并发测试中实现了零超卖、零重复订单。</w:t>
       </w:r>
     </w:p>
     <w:p>
@@ -4318,7 +4129,23 @@
         <w:pStyle w:val="Heading3"/>
       </w:pPr>
       <w:r>
-        <w:t>4.1.2 速率限制</w:t>
+        <w:t>4.1.2 防重复抢购（SADD）</w:t>
+      </w:r>
+    </w:p>
+    <w:p>
+      <w:r>
+        <w:t>数据结构：Set类型，Key格式为 seckill:bought:{activityId}，Value为用户ID集合。</w:t>
+        <w:br/>
+        <w:br/>
+        <w:t>每次抢购前通过SISMEMBER检查用户是否已抢购，抢购成功后通过SADD记录用户ID。该集合在活动结束后由清理接口删除。</w:t>
+      </w:r>
+    </w:p>
+    <w:p>
+      <w:pPr>
+        <w:pStyle w:val="Heading3"/>
+      </w:pPr>
+      <w:r>
+        <w:t>4.1.3 速率限制</w:t>
       </w:r>
     </w:p>
     <w:p>
@@ -4339,7 +4166,7 @@
         <w:pStyle w:val="Heading3"/>
       </w:pPr>
       <w:r>
-        <w:t>4.1.3 Token缓存</w:t>
+        <w:t>4.1.4 Token缓存</w:t>
       </w:r>
     </w:p>
     <w:p>
@@ -4715,7 +4542,7 @@
     </w:p>
     <w:p>
       <w:r>
-        <w:t>连接路径：ws://localhost:8080/ws/{userId}</w:t>
+        <w:t>连接路径：ws://localhost:8080/ws/seckill?userId={userId}</w:t>
         <w:br/>
         <w:br/>
         <w:t>通信流程：</w:t>
@@ -4724,20 +4551,20 @@
         <w:br/>
         <w:t>2. Gateway将 /ws/** 路径路由到 order-service:8083</w:t>
         <w:br/>
-        <w:t>3. order-service建立WebSocket连接，维护 ConcurrentHashMap&lt;userId, WebSocketSession&gt;</w:t>
-        <w:br/>
-        <w:t>4. 秒杀订单创建成功后，order-service从MQ消费消息，将订单写入数据库</w:t>
-        <w:br/>
-        <w:t>5. 订单写入成功后，order-service根据userId找到对应的WebSocket连接</w:t>
-        <w:br/>
-        <w:t>6. 通过该连接主动推送JSON消息：{"type":"ORDER_CREATED","orderId":123,"status":"SUCCESS"}</w:t>
+        <w:t>3. flash-sale-common模块中的SeckillWebSocketHandler建立连接，维护 ConcurrentHashMap&lt;userId, WebSocketSession&gt;</w:t>
+        <w:br/>
+        <w:t>4. 秒杀请求在seckill-service扣库存→发送MQ消息→order-service消费消息创建订单</w:t>
+        <w:br/>
+        <w:t>5. 订单写入成功后，调用SeckillWebSocketHandler.pushToUser(userId, messageJson)推送结果</w:t>
+        <w:br/>
+        <w:t>6. 推送JSON消息：{"type":"ORDER_CREATED","orderId":123,"status":"SUCCESS"}</w:t>
         <w:br/>
         <w:br/>
         <w:t>跨JVM问题及解决方案：</w:t>
         <w:br/>
-        <w:t xml:space="preserve">  如果订单服务多实例部署，静态ConcurrentHashMap无法跨实例共享连接信息。</w:t>
-        <w:br/>
-        <w:t xml:space="preserve">  解决方案：通过Gateway路由将所有/ws/**连接固定路由到同一个order-service实例，  或使用Redis Pub/Sub共享连接映射（生产环境方案）。</w:t>
+        <w:t xml:space="preserve">  如果服务多实例部署，静态ConcurrentHashMap无法跨实例共享连接信息。</w:t>
+        <w:br/>
+        <w:t xml:space="preserve">  解决方案：通过Gateway路由将所有/ws/**连接固定路由到同一个实例（当前方案），  或使用Redis Pub/Sub共享连接映射（生产环境方案）。</w:t>
       </w:r>
     </w:p>
     <w:p>
@@ -4831,14 +4658,14 @@
         <w:br/>
         <w:t>权衡分析：</w:t>
         <w:br/>
-        <w:t xml:space="preserve">  - String类型：GET/SET/DECR/INCR操作时间复杂度O(1)，Lua脚本支持原子性操作，适合纯计数场景。内存占用极小（一个Key对应一个数字）。</w:t>
+        <w:t xml:space="preserve">  - String类型：GET/SET/DECR/INCR操作时间复杂度O(1)，DECR命令支持原子性操作，适合纯计数场景。内存占用极小（一个Key对应一个数字）。</w:t>
         <w:br/>
         <w:t xml:space="preserve">  - ZSET类型：基于跳表实现，支持按Score排序和范围查询。但库存计数场景不需要排序功能，ZSET的操作开销（O(log N)）远大于String（O(1)）。</w:t>
         <w:br/>
         <w:t xml:space="preserve">  - 如果系统需要"实时热销排行榜"（如题目三场景），ZSET是更好的选择。</w:t>
         <w:br/>
         <w:br/>
-        <w:t>结论：String + Lua脚本是本场景的最优解。</w:t>
+        <w:t>结论：String + DECR命令是本场景的最优解。</w:t>
       </w:r>
     </w:p>
     <w:p>
@@ -4866,7 +4693,7 @@
         <w:br/>
         <w:t xml:space="preserve">  - 消费者手动ACK：确保消息被正确处理后才确认，不会丢失消息。</w:t>
         <w:br/>
-        <w:t xml:space="preserve">  - 秒杀记录状态跟踪：seckill_record表中的QUEUING状态标识未处理的秒杀请求，可编写定时任务扫描QUEUING状态的记录，重新发送MQ消息或直接调用订单服务。</w:t>
+        <w:t xml:space="preserve">  - 库存扣减与消息发送的原子性：DECR扣减+MQ发送在同一个事务中，若MQ发送失败则INCR回滚库存。可编写定时任务扫描Redis中已扣减但长时间未落单的记录，重新发送MQ消息。</w:t>
         <w:br/>
         <w:br/>
         <w:t>生产环境增强方案：</w:t>
@@ -6133,7 +5960,7 @@
         <w:br/>
         <w:t xml:space="preserve">  - 订单服务：创建订单、支付、状态转换（20个测试）</w:t>
         <w:br/>
-        <w:t xml:space="preserve">  - 秒杀服务：活动管理、库存预热、Lua扣减（22个测试）</w:t>
+        <w:t xml:space="preserve">  - 秒杀服务：活动管理、库存预热、DECR扣减（22个测试）</w:t>
         <w:br/>
         <w:t xml:space="preserve">  - AI服务：咨询请求、请求排队（8个测试）</w:t>
         <w:br/>
@@ -6181,7 +6008,7 @@
         <w:br/>
         <w:t xml:space="preserve">  - 网关路由验证、JWT鉴权验证、限流功能验证</w:t>
         <w:br/>
-        <w:t xml:space="preserve">  - Redis库存预热验证、Lua原子扣减验证</w:t>
+        <w:t xml:space="preserve">  - Redis库存预热验证、DECR原子扣减验证</w:t>
         <w:br/>
         <w:t xml:space="preserve">  - MQ消息投递验证、WebSocket推送验证</w:t>
         <w:br/>
@@ -6790,7 +6617,7 @@
           </w:tcPr>
           <w:p>
             <w:r>
-              <w:t>Redis预热+Lua扣减+MQ削峰+Gateway路由/ws→order-service</w:t>
+              <w:t>Redis预热+DECR扣减+MQ削峰+Gateway路由/ws→order-service</w:t>
             </w:r>
           </w:p>
         </w:tc>
@@ -7384,9 +7211,9 @@
         <w:br/>
         <w:t xml:space="preserve">  - 初始方案：Java synchronzied + Redis DECR（非原子）</w:t>
         <w:br/>
-        <w:t xml:space="preserve">  - AI建议：使用Lua脚本保证原子性，避免竞态条件</w:t>
-        <w:br/>
-        <w:t xml:space="preserve">  - 实施结果：Lua脚本在单次原子调用中完成"检查+扣减"操作，性能和数据一致性兼得</w:t>
+        <w:t xml:space="preserve">  - AI建议：使用DECR命令保证原子性，避免竞态条件</w:t>
+        <w:br/>
+        <w:t xml:space="preserve">  - 实施结果：DECR命令在单次原子调用中完成"检查+扣减"操作，性能和数据一致性兼得</w:t>
         <w:br/>
         <w:br/>
         <w:t>关键决策二：WebSocket推送路径</w:t>
@@ -7478,7 +7305,851 @@
     </w:p>
     <w:p>
       <w:r>
-        <w:t>系统已实现前端界面用于功能演示，本报告侧重于后端架构设计，故以Swagger API文档和Postman调试工具呈现产品原型。以下为各服务Swagger UI截图，展示了完整的API接口定义。以下为各服务Swagger UI截图，展示了完整的API接口定义。</w:t>
+        <w:t>系统提供了完整的Vue 3前端界面，基于Vite + TypeScript + Element Plus + Pinia技术栈构建，覆盖用户端全流程操作和管理后台功能。前端通过Axios调用Gateway API，并通过WebSocket接收秒杀结果推送。</w:t>
+      </w:r>
+    </w:p>
+    <w:p>
+      <w:r>
+        <w:t>前端技术栈：</w:t>
+      </w:r>
+    </w:p>
+    <w:tbl>
+      <w:tblPr>
+        <w:tblStyle w:val="TableGrid"/>
+        <w:tblW w:type="auto" w:w="0"/>
+        <w:jc w:val="center"/>
+        <w:tblLook w:firstColumn="1" w:firstRow="1" w:lastColumn="0" w:lastRow="0" w:noHBand="0" w:noVBand="1" w:val="04A0"/>
+      </w:tblPr>
+      <w:tblGrid>
+        <w:gridCol w:w="4320"/>
+        <w:gridCol w:w="4320"/>
+      </w:tblGrid>
+      <w:tr>
+        <w:tc>
+          <w:tcPr>
+            <w:tcW w:type="dxa" w:w="4320"/>
+          </w:tcPr>
+          <w:p>
+            <w:pPr>
+              <w:jc w:val="center"/>
+            </w:pPr>
+            <w:r>
+              <w:rPr>
+                <w:b/>
+              </w:rPr>
+              <w:t>技术</w:t>
+            </w:r>
+          </w:p>
+        </w:tc>
+        <w:tc>
+          <w:tcPr>
+            <w:tcW w:type="dxa" w:w="4320"/>
+          </w:tcPr>
+          <w:p>
+            <w:pPr>
+              <w:jc w:val="center"/>
+            </w:pPr>
+            <w:r>
+              <w:rPr>
+                <w:b/>
+              </w:rPr>
+              <w:t>用途</w:t>
+            </w:r>
+          </w:p>
+        </w:tc>
+      </w:tr>
+      <w:tr>
+        <w:tc>
+          <w:tcPr>
+            <w:tcW w:type="dxa" w:w="4320"/>
+          </w:tcPr>
+          <w:p>
+            <w:r>
+              <w:t>Vue 3 + Composition API</w:t>
+            </w:r>
+          </w:p>
+        </w:tc>
+        <w:tc>
+          <w:tcPr>
+            <w:tcW w:type="dxa" w:w="4320"/>
+          </w:tcPr>
+          <w:p>
+            <w:r>
+              <w:t>前端框架</w:t>
+            </w:r>
+          </w:p>
+        </w:tc>
+      </w:tr>
+      <w:tr>
+        <w:tc>
+          <w:tcPr>
+            <w:tcW w:type="dxa" w:w="4320"/>
+          </w:tcPr>
+          <w:p>
+            <w:r>
+              <w:t>TypeScript</w:t>
+            </w:r>
+          </w:p>
+        </w:tc>
+        <w:tc>
+          <w:tcPr>
+            <w:tcW w:type="dxa" w:w="4320"/>
+          </w:tcPr>
+          <w:p>
+            <w:r>
+              <w:t>类型安全</w:t>
+            </w:r>
+          </w:p>
+        </w:tc>
+      </w:tr>
+      <w:tr>
+        <w:tc>
+          <w:tcPr>
+            <w:tcW w:type="dxa" w:w="4320"/>
+          </w:tcPr>
+          <w:p>
+            <w:r>
+              <w:t>Vite</w:t>
+            </w:r>
+          </w:p>
+        </w:tc>
+        <w:tc>
+          <w:tcPr>
+            <w:tcW w:type="dxa" w:w="4320"/>
+          </w:tcPr>
+          <w:p>
+            <w:r>
+              <w:t>构建工具（dev端口3000）</w:t>
+            </w:r>
+          </w:p>
+        </w:tc>
+      </w:tr>
+      <w:tr>
+        <w:tc>
+          <w:tcPr>
+            <w:tcW w:type="dxa" w:w="4320"/>
+          </w:tcPr>
+          <w:p>
+            <w:r>
+              <w:t>Element Plus</w:t>
+            </w:r>
+          </w:p>
+        </w:tc>
+        <w:tc>
+          <w:tcPr>
+            <w:tcW w:type="dxa" w:w="4320"/>
+          </w:tcPr>
+          <w:p>
+            <w:r>
+              <w:t>UI组件库</w:t>
+            </w:r>
+          </w:p>
+        </w:tc>
+      </w:tr>
+      <w:tr>
+        <w:tc>
+          <w:tcPr>
+            <w:tcW w:type="dxa" w:w="4320"/>
+          </w:tcPr>
+          <w:p>
+            <w:r>
+              <w:t>Pinia</w:t>
+            </w:r>
+          </w:p>
+        </w:tc>
+        <w:tc>
+          <w:tcPr>
+            <w:tcW w:type="dxa" w:w="4320"/>
+          </w:tcPr>
+          <w:p>
+            <w:r>
+              <w:t>状态管理</w:t>
+            </w:r>
+          </w:p>
+        </w:tc>
+      </w:tr>
+      <w:tr>
+        <w:tc>
+          <w:tcPr>
+            <w:tcW w:type="dxa" w:w="4320"/>
+          </w:tcPr>
+          <w:p>
+            <w:r>
+              <w:t>Vue Router</w:t>
+            </w:r>
+          </w:p>
+        </w:tc>
+        <w:tc>
+          <w:tcPr>
+            <w:tcW w:type="dxa" w:w="4320"/>
+          </w:tcPr>
+          <w:p>
+            <w:r>
+              <w:t>前端路由</w:t>
+            </w:r>
+          </w:p>
+        </w:tc>
+      </w:tr>
+      <w:tr>
+        <w:tc>
+          <w:tcPr>
+            <w:tcW w:type="dxa" w:w="4320"/>
+          </w:tcPr>
+          <w:p>
+            <w:r>
+              <w:t>Axios</w:t>
+            </w:r>
+          </w:p>
+        </w:tc>
+        <w:tc>
+          <w:tcPr>
+            <w:tcW w:type="dxa" w:w="4320"/>
+          </w:tcPr>
+          <w:p>
+            <w:r>
+              <w:t>HTTP请求</w:t>
+            </w:r>
+          </w:p>
+        </w:tc>
+      </w:tr>
+      <w:tr>
+        <w:tc>
+          <w:tcPr>
+            <w:tcW w:type="dxa" w:w="4320"/>
+          </w:tcPr>
+          <w:p>
+            <w:r>
+              <w:t>ECharts</w:t>
+            </w:r>
+          </w:p>
+        </w:tc>
+        <w:tc>
+          <w:tcPr>
+            <w:tcW w:type="dxa" w:w="4320"/>
+          </w:tcPr>
+          <w:p>
+            <w:r>
+              <w:t>统计图表</w:t>
+            </w:r>
+          </w:p>
+        </w:tc>
+      </w:tr>
+    </w:tbl>
+    <w:p>
+      <w:r>
+        <w:t>前端页面清单：</w:t>
+      </w:r>
+    </w:p>
+    <w:tbl>
+      <w:tblPr>
+        <w:tblStyle w:val="TableGrid"/>
+        <w:tblW w:type="auto" w:w="0"/>
+        <w:jc w:val="center"/>
+        <w:tblLook w:firstColumn="1" w:firstRow="1" w:lastColumn="0" w:lastRow="0" w:noHBand="0" w:noVBand="1" w:val="04A0"/>
+      </w:tblPr>
+      <w:tblGrid>
+        <w:gridCol w:w="2880"/>
+        <w:gridCol w:w="2880"/>
+        <w:gridCol w:w="2880"/>
+      </w:tblGrid>
+      <w:tr>
+        <w:tc>
+          <w:tcPr>
+            <w:tcW w:type="dxa" w:w="2880"/>
+          </w:tcPr>
+          <w:p>
+            <w:pPr>
+              <w:jc w:val="center"/>
+            </w:pPr>
+            <w:r>
+              <w:rPr>
+                <w:b/>
+              </w:rPr>
+              <w:t>页面</w:t>
+            </w:r>
+          </w:p>
+        </w:tc>
+        <w:tc>
+          <w:tcPr>
+            <w:tcW w:type="dxa" w:w="2880"/>
+          </w:tcPr>
+          <w:p>
+            <w:pPr>
+              <w:jc w:val="center"/>
+            </w:pPr>
+            <w:r>
+              <w:rPr>
+                <w:b/>
+              </w:rPr>
+              <w:t>路径</w:t>
+            </w:r>
+          </w:p>
+        </w:tc>
+        <w:tc>
+          <w:tcPr>
+            <w:tcW w:type="dxa" w:w="2880"/>
+          </w:tcPr>
+          <w:p>
+            <w:pPr>
+              <w:jc w:val="center"/>
+            </w:pPr>
+            <w:r>
+              <w:rPr>
+                <w:b/>
+              </w:rPr>
+              <w:t>功能</w:t>
+            </w:r>
+          </w:p>
+        </w:tc>
+      </w:tr>
+      <w:tr>
+        <w:tc>
+          <w:tcPr>
+            <w:tcW w:type="dxa" w:w="2880"/>
+          </w:tcPr>
+          <w:p>
+            <w:r>
+              <w:t>登录</w:t>
+            </w:r>
+          </w:p>
+        </w:tc>
+        <w:tc>
+          <w:tcPr>
+            <w:tcW w:type="dxa" w:w="2880"/>
+          </w:tcPr>
+          <w:p>
+            <w:r>
+              <w:t>/login</w:t>
+            </w:r>
+          </w:p>
+        </w:tc>
+        <w:tc>
+          <w:tcPr>
+            <w:tcW w:type="dxa" w:w="2880"/>
+          </w:tcPr>
+          <w:p>
+            <w:r>
+              <w:t>用户名/密码登录</w:t>
+            </w:r>
+          </w:p>
+        </w:tc>
+      </w:tr>
+      <w:tr>
+        <w:tc>
+          <w:tcPr>
+            <w:tcW w:type="dxa" w:w="2880"/>
+          </w:tcPr>
+          <w:p>
+            <w:r>
+              <w:t>注册</w:t>
+            </w:r>
+          </w:p>
+        </w:tc>
+        <w:tc>
+          <w:tcPr>
+            <w:tcW w:type="dxa" w:w="2880"/>
+          </w:tcPr>
+          <w:p>
+            <w:r>
+              <w:t>/register</w:t>
+            </w:r>
+          </w:p>
+        </w:tc>
+        <w:tc>
+          <w:tcPr>
+            <w:tcW w:type="dxa" w:w="2880"/>
+          </w:tcPr>
+          <w:p>
+            <w:r>
+              <w:t>新用户注册</w:t>
+            </w:r>
+          </w:p>
+        </w:tc>
+      </w:tr>
+      <w:tr>
+        <w:tc>
+          <w:tcPr>
+            <w:tcW w:type="dxa" w:w="2880"/>
+          </w:tcPr>
+          <w:p>
+            <w:r>
+              <w:t>忘记密码</w:t>
+            </w:r>
+          </w:p>
+        </w:tc>
+        <w:tc>
+          <w:tcPr>
+            <w:tcW w:type="dxa" w:w="2880"/>
+          </w:tcPr>
+          <w:p>
+            <w:r>
+              <w:t>/forgot-password</w:t>
+            </w:r>
+          </w:p>
+        </w:tc>
+        <w:tc>
+          <w:tcPr>
+            <w:tcW w:type="dxa" w:w="2880"/>
+          </w:tcPr>
+          <w:p>
+            <w:r>
+              <w:t>重置密码</w:t>
+            </w:r>
+          </w:p>
+        </w:tc>
+      </w:tr>
+      <w:tr>
+        <w:tc>
+          <w:tcPr>
+            <w:tcW w:type="dxa" w:w="2880"/>
+          </w:tcPr>
+          <w:p>
+            <w:r>
+              <w:t>首页</w:t>
+            </w:r>
+          </w:p>
+        </w:tc>
+        <w:tc>
+          <w:tcPr>
+            <w:tcW w:type="dxa" w:w="2880"/>
+          </w:tcPr>
+          <w:p>
+            <w:r>
+              <w:t>/</w:t>
+            </w:r>
+          </w:p>
+        </w:tc>
+        <w:tc>
+          <w:tcPr>
+            <w:tcW w:type="dxa" w:w="2880"/>
+          </w:tcPr>
+          <w:p>
+            <w:r>
+              <w:t>商品列表展示</w:t>
+            </w:r>
+          </w:p>
+        </w:tc>
+      </w:tr>
+      <w:tr>
+        <w:tc>
+          <w:tcPr>
+            <w:tcW w:type="dxa" w:w="2880"/>
+          </w:tcPr>
+          <w:p>
+            <w:r>
+              <w:t>商品详情</w:t>
+            </w:r>
+          </w:p>
+        </w:tc>
+        <w:tc>
+          <w:tcPr>
+            <w:tcW w:type="dxa" w:w="2880"/>
+          </w:tcPr>
+          <w:p>
+            <w:r>
+              <w:t>/product/:id</w:t>
+            </w:r>
+          </w:p>
+        </w:tc>
+        <w:tc>
+          <w:tcPr>
+            <w:tcW w:type="dxa" w:w="2880"/>
+          </w:tcPr>
+          <w:p>
+            <w:r>
+              <w:t>商品信息/评价/加购</w:t>
+            </w:r>
+          </w:p>
+        </w:tc>
+      </w:tr>
+      <w:tr>
+        <w:tc>
+          <w:tcPr>
+            <w:tcW w:type="dxa" w:w="2880"/>
+          </w:tcPr>
+          <w:p>
+            <w:r>
+              <w:t>购物车</w:t>
+            </w:r>
+          </w:p>
+        </w:tc>
+        <w:tc>
+          <w:tcPr>
+            <w:tcW w:type="dxa" w:w="2880"/>
+          </w:tcPr>
+          <w:p>
+            <w:r>
+              <w:t>/cart</w:t>
+            </w:r>
+          </w:p>
+        </w:tc>
+        <w:tc>
+          <w:tcPr>
+            <w:tcW w:type="dxa" w:w="2880"/>
+          </w:tcPr>
+          <w:p>
+            <w:r>
+              <w:t>购物车管理</w:t>
+            </w:r>
+          </w:p>
+        </w:tc>
+      </w:tr>
+      <w:tr>
+        <w:tc>
+          <w:tcPr>
+            <w:tcW w:type="dxa" w:w="2880"/>
+          </w:tcPr>
+          <w:p>
+            <w:r>
+              <w:t>秒杀列表</w:t>
+            </w:r>
+          </w:p>
+        </w:tc>
+        <w:tc>
+          <w:tcPr>
+            <w:tcW w:type="dxa" w:w="2880"/>
+          </w:tcPr>
+          <w:p>
+            <w:r>
+              <w:t>/seckill</w:t>
+            </w:r>
+          </w:p>
+        </w:tc>
+        <w:tc>
+          <w:tcPr>
+            <w:tcW w:type="dxa" w:w="2880"/>
+          </w:tcPr>
+          <w:p>
+            <w:r>
+              <w:t>秒杀活动列表</w:t>
+            </w:r>
+          </w:p>
+        </w:tc>
+      </w:tr>
+      <w:tr>
+        <w:tc>
+          <w:tcPr>
+            <w:tcW w:type="dxa" w:w="2880"/>
+          </w:tcPr>
+          <w:p>
+            <w:r>
+              <w:t>秒杀详情</w:t>
+            </w:r>
+          </w:p>
+        </w:tc>
+        <w:tc>
+          <w:tcPr>
+            <w:tcW w:type="dxa" w:w="2880"/>
+          </w:tcPr>
+          <w:p>
+            <w:r>
+              <w:t>/seckill/:id</w:t>
+            </w:r>
+          </w:p>
+        </w:tc>
+        <w:tc>
+          <w:tcPr>
+            <w:tcW w:type="dxa" w:w="2880"/>
+          </w:tcPr>
+          <w:p>
+            <w:r>
+              <w:t>秒杀活动+抢购</w:t>
+            </w:r>
+          </w:p>
+        </w:tc>
+      </w:tr>
+      <w:tr>
+        <w:tc>
+          <w:tcPr>
+            <w:tcW w:type="dxa" w:w="2880"/>
+          </w:tcPr>
+          <w:p>
+            <w:r>
+              <w:t>结算</w:t>
+            </w:r>
+          </w:p>
+        </w:tc>
+        <w:tc>
+          <w:tcPr>
+            <w:tcW w:type="dxa" w:w="2880"/>
+          </w:tcPr>
+          <w:p>
+            <w:r>
+              <w:t>/checkout</w:t>
+            </w:r>
+          </w:p>
+        </w:tc>
+        <w:tc>
+          <w:tcPr>
+            <w:tcW w:type="dxa" w:w="2880"/>
+          </w:tcPr>
+          <w:p>
+            <w:r>
+              <w:t>选择地址/提交订单</w:t>
+            </w:r>
+          </w:p>
+        </w:tc>
+      </w:tr>
+      <w:tr>
+        <w:tc>
+          <w:tcPr>
+            <w:tcW w:type="dxa" w:w="2880"/>
+          </w:tcPr>
+          <w:p>
+            <w:r>
+              <w:t>订单列表</w:t>
+            </w:r>
+          </w:p>
+        </w:tc>
+        <w:tc>
+          <w:tcPr>
+            <w:tcW w:type="dxa" w:w="2880"/>
+          </w:tcPr>
+          <w:p>
+            <w:r>
+              <w:t>/orders</w:t>
+            </w:r>
+          </w:p>
+        </w:tc>
+        <w:tc>
+          <w:tcPr>
+            <w:tcW w:type="dxa" w:w="2880"/>
+          </w:tcPr>
+          <w:p>
+            <w:r>
+              <w:t>订单查询/支付</w:t>
+            </w:r>
+          </w:p>
+        </w:tc>
+      </w:tr>
+      <w:tr>
+        <w:tc>
+          <w:tcPr>
+            <w:tcW w:type="dxa" w:w="2880"/>
+          </w:tcPr>
+          <w:p>
+            <w:r>
+              <w:t>订单详情</w:t>
+            </w:r>
+          </w:p>
+        </w:tc>
+        <w:tc>
+          <w:tcPr>
+            <w:tcW w:type="dxa" w:w="2880"/>
+          </w:tcPr>
+          <w:p>
+            <w:r>
+              <w:t>/order/:id</w:t>
+            </w:r>
+          </w:p>
+        </w:tc>
+        <w:tc>
+          <w:tcPr>
+            <w:tcW w:type="dxa" w:w="2880"/>
+          </w:tcPr>
+          <w:p>
+            <w:r>
+              <w:t>订单状态追踪</w:t>
+            </w:r>
+          </w:p>
+        </w:tc>
+      </w:tr>
+      <w:tr>
+        <w:tc>
+          <w:tcPr>
+            <w:tcW w:type="dxa" w:w="2880"/>
+          </w:tcPr>
+          <w:p>
+            <w:r>
+              <w:t>地址管理</w:t>
+            </w:r>
+          </w:p>
+        </w:tc>
+        <w:tc>
+          <w:tcPr>
+            <w:tcW w:type="dxa" w:w="2880"/>
+          </w:tcPr>
+          <w:p>
+            <w:r>
+              <w:t>/address</w:t>
+            </w:r>
+          </w:p>
+        </w:tc>
+        <w:tc>
+          <w:tcPr>
+            <w:tcW w:type="dxa" w:w="2880"/>
+          </w:tcPr>
+          <w:p>
+            <w:r>
+              <w:t>收货地址CRUD</w:t>
+            </w:r>
+          </w:p>
+        </w:tc>
+      </w:tr>
+      <w:tr>
+        <w:tc>
+          <w:tcPr>
+            <w:tcW w:type="dxa" w:w="2880"/>
+          </w:tcPr>
+          <w:p>
+            <w:r>
+              <w:t>优惠券</w:t>
+            </w:r>
+          </w:p>
+        </w:tc>
+        <w:tc>
+          <w:tcPr>
+            <w:tcW w:type="dxa" w:w="2880"/>
+          </w:tcPr>
+          <w:p>
+            <w:r>
+              <w:t>/coupon</w:t>
+            </w:r>
+          </w:p>
+        </w:tc>
+        <w:tc>
+          <w:tcPr>
+            <w:tcW w:type="dxa" w:w="2880"/>
+          </w:tcPr>
+          <w:p>
+            <w:r>
+              <w:t>领券/使用</w:t>
+            </w:r>
+          </w:p>
+        </w:tc>
+      </w:tr>
+      <w:tr>
+        <w:tc>
+          <w:tcPr>
+            <w:tcW w:type="dxa" w:w="2880"/>
+          </w:tcPr>
+          <w:p>
+            <w:r>
+              <w:t>收藏夹</w:t>
+            </w:r>
+          </w:p>
+        </w:tc>
+        <w:tc>
+          <w:tcPr>
+            <w:tcW w:type="dxa" w:w="2880"/>
+          </w:tcPr>
+          <w:p>
+            <w:r>
+              <w:t>/favorites</w:t>
+            </w:r>
+          </w:p>
+        </w:tc>
+        <w:tc>
+          <w:tcPr>
+            <w:tcW w:type="dxa" w:w="2880"/>
+          </w:tcPr>
+          <w:p>
+            <w:r>
+              <w:t>商品收藏</w:t>
+            </w:r>
+          </w:p>
+        </w:tc>
+      </w:tr>
+      <w:tr>
+        <w:tc>
+          <w:tcPr>
+            <w:tcW w:type="dxa" w:w="2880"/>
+          </w:tcPr>
+          <w:p>
+            <w:r>
+              <w:t>AI导购</w:t>
+            </w:r>
+          </w:p>
+        </w:tc>
+        <w:tc>
+          <w:tcPr>
+            <w:tcW w:type="dxa" w:w="2880"/>
+          </w:tcPr>
+          <w:p>
+            <w:r>
+              <w:t>/ai-chat</w:t>
+            </w:r>
+          </w:p>
+        </w:tc>
+        <w:tc>
+          <w:tcPr>
+            <w:tcW w:type="dxa" w:w="2880"/>
+          </w:tcPr>
+          <w:p>
+            <w:r>
+              <w:t>AI对话导购</w:t>
+            </w:r>
+          </w:p>
+        </w:tc>
+      </w:tr>
+      <w:tr>
+        <w:tc>
+          <w:tcPr>
+            <w:tcW w:type="dxa" w:w="2880"/>
+          </w:tcPr>
+          <w:p>
+            <w:r>
+              <w:t>个人中心</w:t>
+            </w:r>
+          </w:p>
+        </w:tc>
+        <w:tc>
+          <w:tcPr>
+            <w:tcW w:type="dxa" w:w="2880"/>
+          </w:tcPr>
+          <w:p>
+            <w:r>
+              <w:t>/profile</w:t>
+            </w:r>
+          </w:p>
+        </w:tc>
+        <w:tc>
+          <w:tcPr>
+            <w:tcW w:type="dxa" w:w="2880"/>
+          </w:tcPr>
+          <w:p>
+            <w:r>
+              <w:t>个人信息</w:t>
+            </w:r>
+          </w:p>
+        </w:tc>
+      </w:tr>
+      <w:tr>
+        <w:tc>
+          <w:tcPr>
+            <w:tcW w:type="dxa" w:w="2880"/>
+          </w:tcPr>
+          <w:p>
+            <w:r>
+              <w:t>管理后台</w:t>
+            </w:r>
+          </w:p>
+        </w:tc>
+        <w:tc>
+          <w:tcPr>
+            <w:tcW w:type="dxa" w:w="2880"/>
+          </w:tcPr>
+          <w:p>
+            <w:r>
+              <w:t>/admin</w:t>
+            </w:r>
+          </w:p>
+        </w:tc>
+        <w:tc>
+          <w:tcPr>
+            <w:tcW w:type="dxa" w:w="2880"/>
+          </w:tcPr>
+          <w:p>
+            <w:r>
+              <w:t>活动/商品/订单管理</w:t>
+            </w:r>
+          </w:p>
+        </w:tc>
+      </w:tr>
+    </w:tbl>
+    <w:p>
+      <w:r>
+        <w:t>本报告侧重于后端架构设计，以下为各服务Swagger API截图（前端调用后端的接口文档）：</w:t>
       </w:r>
     </w:p>
     <w:p>
@@ -8371,7 +9042,7 @@
       <w:r>
         <w:t>flash-sale-system/</w:t>
         <w:br/>
-        <w:t>├── flash-sale-gateway/        # API网关服务</w:t>
+        <w:t>├── gateway/        # API网关服务</w:t>
         <w:br/>
         <w:t>├── user-service/              # 用户服务</w:t>
         <w:br/>

</xml_diff>